<commit_message>
Update resume v17 — build script + md/docx/pdf 갱신
</commit_message>
<xml_diff>
--- a/resume/resume_v17.docx
+++ b/resume/resume_v17.docx
@@ -25,13 +25,136 @@
       <w:r>
         <w:rPr>
           <w:rFonts w:ascii="Pretendard" w:hAnsi="Pretendard" w:eastAsia="Pretendard" w:cs="Pretendard"/>
-          <w:b w:val="0"/>
-          <w:i w:val="0"/>
-          <w:color w:val="1F2937"/>
-          <w:sz w:val="21"/>
-        </w:rPr>
-        <w:t>010-9101-5429  ｜ digle117@gmail.com  ｜ github.com/PreAgile  ｜ astro-paper-23v.pages.dev</w:t>
-      </w:r>
+          <w:b/>
+          <w:i w:val="0"/>
+          <w:color w:val="1F2937"/>
+          <w:sz w:val="21"/>
+        </w:rPr>
+        <w:t>📞 연락처</w:t>
+      </w:r>
+      <w:r>
+        <w:rPr>
+          <w:rFonts w:ascii="Pretendard" w:hAnsi="Pretendard" w:eastAsia="Pretendard" w:cs="Pretendard"/>
+          <w:b w:val="0"/>
+          <w:i w:val="0"/>
+          <w:color w:val="1F2937"/>
+          <w:sz w:val="21"/>
+        </w:rPr>
+        <w:t xml:space="preserve"> 010-9101-5429  </w:t>
+      </w:r>
+      <w:r>
+        <w:rPr>
+          <w:rFonts w:ascii="Pretendard" w:hAnsi="Pretendard" w:eastAsia="Pretendard" w:cs="Pretendard"/>
+          <w:b/>
+          <w:i w:val="0"/>
+          <w:color w:val="1F2937"/>
+          <w:sz w:val="21"/>
+        </w:rPr>
+        <w:t>｜ ✉ 이메일</w:t>
+      </w:r>
+      <w:r>
+        <w:rPr>
+          <w:rFonts w:ascii="Pretendard" w:hAnsi="Pretendard" w:eastAsia="Pretendard" w:cs="Pretendard"/>
+          <w:b w:val="0"/>
+          <w:i w:val="0"/>
+          <w:color w:val="1F2937"/>
+          <w:sz w:val="21"/>
+        </w:rPr>
+        <w:t xml:space="preserve"> </w:t>
+      </w:r>
+      <w:hyperlink r:id="rId10">
+        <w:r>
+          <w:rPr>
+            <w:rFonts w:ascii="Pretendard" w:hAnsi="Pretendard" w:eastAsia="Pretendard" w:cs="Pretendard"/>
+            <w:sz w:val="21"/>
+            <w:color w:val="1d4ed8"/>
+            <w:u w:val="single"/>
+          </w:rPr>
+          <w:t xml:space="preserve">digle117@gmail.com</w:t>
+        </w:r>
+      </w:hyperlink>
+      <w:r>
+        <w:rPr>
+          <w:rFonts w:ascii="Pretendard" w:hAnsi="Pretendard" w:eastAsia="Pretendard" w:cs="Pretendard"/>
+          <w:b w:val="0"/>
+          <w:i w:val="0"/>
+          <w:color w:val="1F2937"/>
+          <w:sz w:val="21"/>
+        </w:rPr>
+        <w:t xml:space="preserve">  </w:t>
+      </w:r>
+      <w:r>
+        <w:rPr>
+          <w:rFonts w:ascii="Pretendard" w:hAnsi="Pretendard" w:eastAsia="Pretendard" w:cs="Pretendard"/>
+          <w:b/>
+          <w:i w:val="0"/>
+          <w:color w:val="1F2937"/>
+          <w:sz w:val="21"/>
+        </w:rPr>
+        <w:t>｜ 💻 GitHub</w:t>
+      </w:r>
+      <w:r>
+        <w:rPr>
+          <w:rFonts w:ascii="Pretendard" w:hAnsi="Pretendard" w:eastAsia="Pretendard" w:cs="Pretendard"/>
+          <w:b w:val="0"/>
+          <w:i w:val="0"/>
+          <w:color w:val="1F2937"/>
+          <w:sz w:val="21"/>
+        </w:rPr>
+        <w:t xml:space="preserve"> </w:t>
+      </w:r>
+      <w:hyperlink r:id="rId11">
+        <w:r>
+          <w:rPr>
+            <w:rFonts w:ascii="Pretendard" w:hAnsi="Pretendard" w:eastAsia="Pretendard" w:cs="Pretendard"/>
+            <w:sz w:val="21"/>
+            <w:color w:val="1d4ed8"/>
+            <w:u w:val="single"/>
+          </w:rPr>
+          <w:t xml:space="preserve">github.com/PreAgile</w:t>
+        </w:r>
+      </w:hyperlink>
+      <w:r>
+        <w:rPr>
+          <w:rFonts w:ascii="Pretendard" w:hAnsi="Pretendard" w:eastAsia="Pretendard" w:cs="Pretendard"/>
+          <w:b w:val="0"/>
+          <w:i w:val="0"/>
+          <w:color w:val="1F2937"/>
+          <w:sz w:val="21"/>
+        </w:rPr>
+        <w:t xml:space="preserve">  </w:t>
+      </w:r>
+      <w:r>
+        <w:rPr>
+          <w:rFonts w:ascii="Pretendard" w:hAnsi="Pretendard" w:eastAsia="Pretendard" w:cs="Pretendard"/>
+          <w:b/>
+          <w:i w:val="0"/>
+          <w:color w:val="1F2937"/>
+          <w:sz w:val="21"/>
+        </w:rPr>
+        <w:t>｜ 📝 기술 블로그</w:t>
+      </w:r>
+      <w:r>
+        <w:rPr>
+          <w:rFonts w:ascii="Pretendard" w:hAnsi="Pretendard" w:eastAsia="Pretendard" w:cs="Pretendard"/>
+          <w:b w:val="0"/>
+          <w:i w:val="0"/>
+          <w:color w:val="1F2937"/>
+          <w:sz w:val="21"/>
+        </w:rPr>
+        <w:t xml:space="preserve"> </w:t>
+      </w:r>
+      <w:hyperlink r:id="rId12">
+        <w:r>
+          <w:rPr>
+            <w:rFonts w:ascii="Pretendard" w:hAnsi="Pretendard" w:eastAsia="Pretendard" w:cs="Pretendard"/>
+            <w:sz w:val="21"/>
+            <w:color w:val="1d4ed8"/>
+            <w:u w:val="single"/>
+          </w:rPr>
+          <w:t xml:space="preserve">astro-paper-23v.pages.dev</w:t>
+        </w:r>
+      </w:hyperlink>
     </w:p>
     <w:p>
       <w:pPr>
@@ -1098,6 +1221,17 @@
         <w:keepNext/>
         <w:spacing w:before="200" w:after="80" w:line="276" w:lineRule="auto"/>
       </w:pPr>
+      <w:hyperlink r:id="rId13">
+        <w:r>
+          <w:rPr>
+            <w:rFonts w:ascii="Pretendard" w:hAnsi="Pretendard" w:eastAsia="Pretendard" w:cs="Pretendard"/>
+            <w:sz w:val="25"/>
+            <w:color w:val="1d4ed8"/>
+            <w:u w:val="single"/>
+          </w:rPr>
+          <w:t xml:space="preserve">Kotest</w:t>
+        </w:r>
+      </w:hyperlink>
       <w:r>
         <w:rPr>
           <w:rFonts w:ascii="Pretendard" w:hAnsi="Pretendard" w:eastAsia="Pretendard" w:cs="Pretendard"/>
@@ -1106,7 +1240,7 @@
           <w:color w:val="0F172A"/>
           <w:sz w:val="25"/>
         </w:rPr>
-        <w:t>[Kotest](https://github.com/kotest/kotest) — Kotlin 멀티플랫폼 테스트 프레임워크 (4.7k stars)</w:t>
+        <w:t xml:space="preserve"> — Kotlin 멀티플랫폼 테스트 프레임워크 (4.7k stars)</w:t>
       </w:r>
     </w:p>
     <w:p>
@@ -1158,8 +1292,40 @@
           <w:color w:val="1F2937"/>
           <w:sz w:val="21"/>
         </w:rPr>
-        <w:t>타입 안전 Test Metadata Public API 신규 설계 (+355/-16, 5 리뷰 16h 내 머지) — [issue #5103](https://github.com/kotest/kotest/issues/5103), [PR #5905](https://github.com/kotest/kotest/pull/5905)</w:t>
-      </w:r>
+        <w:t xml:space="preserve">타입 안전 Test Metadata Public API 신규 설계 (+355/-16, 5 리뷰 16h 내 머지) — </w:t>
+      </w:r>
+      <w:hyperlink r:id="rId14">
+        <w:r>
+          <w:rPr>
+            <w:rFonts w:ascii="Pretendard" w:hAnsi="Pretendard" w:eastAsia="Pretendard" w:cs="Pretendard"/>
+            <w:sz w:val="21"/>
+            <w:color w:val="1d4ed8"/>
+            <w:u w:val="single"/>
+          </w:rPr>
+          <w:t xml:space="preserve">issue #5103</w:t>
+        </w:r>
+      </w:hyperlink>
+      <w:r>
+        <w:rPr>
+          <w:rFonts w:ascii="Pretendard" w:hAnsi="Pretendard" w:eastAsia="Pretendard" w:cs="Pretendard"/>
+          <w:b w:val="0"/>
+          <w:i w:val="0"/>
+          <w:color w:val="1F2937"/>
+          <w:sz w:val="21"/>
+        </w:rPr>
+        <w:t xml:space="preserve">, </w:t>
+      </w:r>
+      <w:hyperlink r:id="rId15">
+        <w:r>
+          <w:rPr>
+            <w:rFonts w:ascii="Pretendard" w:hAnsi="Pretendard" w:eastAsia="Pretendard" w:cs="Pretendard"/>
+            <w:sz w:val="21"/>
+            <w:color w:val="1d4ed8"/>
+            <w:u w:val="single"/>
+          </w:rPr>
+          <w:t xml:space="preserve">PR #5905</w:t>
+        </w:r>
+      </w:hyperlink>
     </w:p>
     <w:p>
       <w:pPr>
@@ -1175,8 +1341,40 @@
           <w:color w:val="1F2937"/>
           <w:sz w:val="21"/>
         </w:rPr>
-        <w:t>컬렉션 data class 필드 단위 diff — [issue #2545](https://github.com/kotest/kotest/issues/2545), [PR #5835](https://github.com/kotest/kotest/pull/5835)</w:t>
-      </w:r>
+        <w:t xml:space="preserve">컬렉션 data class 필드 단위 diff — </w:t>
+      </w:r>
+      <w:hyperlink r:id="rId16">
+        <w:r>
+          <w:rPr>
+            <w:rFonts w:ascii="Pretendard" w:hAnsi="Pretendard" w:eastAsia="Pretendard" w:cs="Pretendard"/>
+            <w:sz w:val="21"/>
+            <w:color w:val="1d4ed8"/>
+            <w:u w:val="single"/>
+          </w:rPr>
+          <w:t xml:space="preserve">issue #2545</w:t>
+        </w:r>
+      </w:hyperlink>
+      <w:r>
+        <w:rPr>
+          <w:rFonts w:ascii="Pretendard" w:hAnsi="Pretendard" w:eastAsia="Pretendard" w:cs="Pretendard"/>
+          <w:b w:val="0"/>
+          <w:i w:val="0"/>
+          <w:color w:val="1F2937"/>
+          <w:sz w:val="21"/>
+        </w:rPr>
+        <w:t xml:space="preserve">, </w:t>
+      </w:r>
+      <w:hyperlink r:id="rId17">
+        <w:r>
+          <w:rPr>
+            <w:rFonts w:ascii="Pretendard" w:hAnsi="Pretendard" w:eastAsia="Pretendard" w:cs="Pretendard"/>
+            <w:sz w:val="21"/>
+            <w:color w:val="1d4ed8"/>
+            <w:u w:val="single"/>
+          </w:rPr>
+          <w:t xml:space="preserve">PR #5835</w:t>
+        </w:r>
+      </w:hyperlink>
     </w:p>
     <w:p>
       <w:pPr>
@@ -1192,8 +1390,40 @@
           <w:color w:val="1F2937"/>
           <w:sz w:val="21"/>
         </w:rPr>
-        <w:t>JSON Schema anyOf / oneOf 표준 구현 — [issue #4463](https://github.com/kotest/kotest/issues/4463), [PR #5807](https://github.com/kotest/kotest/pull/5807)</w:t>
-      </w:r>
+        <w:t xml:space="preserve">JSON Schema anyOf / oneOf 표준 구현 — </w:t>
+      </w:r>
+      <w:hyperlink r:id="rId18">
+        <w:r>
+          <w:rPr>
+            <w:rFonts w:ascii="Pretendard" w:hAnsi="Pretendard" w:eastAsia="Pretendard" w:cs="Pretendard"/>
+            <w:sz w:val="21"/>
+            <w:color w:val="1d4ed8"/>
+            <w:u w:val="single"/>
+          </w:rPr>
+          <w:t xml:space="preserve">issue #4463</w:t>
+        </w:r>
+      </w:hyperlink>
+      <w:r>
+        <w:rPr>
+          <w:rFonts w:ascii="Pretendard" w:hAnsi="Pretendard" w:eastAsia="Pretendard" w:cs="Pretendard"/>
+          <w:b w:val="0"/>
+          <w:i w:val="0"/>
+          <w:color w:val="1F2937"/>
+          <w:sz w:val="21"/>
+        </w:rPr>
+        <w:t xml:space="preserve">, </w:t>
+      </w:r>
+      <w:hyperlink r:id="rId19">
+        <w:r>
+          <w:rPr>
+            <w:rFonts w:ascii="Pretendard" w:hAnsi="Pretendard" w:eastAsia="Pretendard" w:cs="Pretendard"/>
+            <w:sz w:val="21"/>
+            <w:color w:val="1d4ed8"/>
+            <w:u w:val="single"/>
+          </w:rPr>
+          <w:t xml:space="preserve">PR #5807</w:t>
+        </w:r>
+      </w:hyperlink>
     </w:p>
     <w:p>
       <w:pPr>
@@ -1209,8 +1439,40 @@
           <w:color w:val="1F2937"/>
           <w:sz w:val="21"/>
         </w:rPr>
-        <w:t>JSON Matchers 커스텀 Json 인스턴스 지원 — [issue #4601](https://github.com/kotest/kotest/issues/4601), [PR #5795](https://github.com/kotest/kotest/pull/5795)</w:t>
-      </w:r>
+        <w:t xml:space="preserve">JSON Matchers 커스텀 Json 인스턴스 지원 — </w:t>
+      </w:r>
+      <w:hyperlink r:id="rId20">
+        <w:r>
+          <w:rPr>
+            <w:rFonts w:ascii="Pretendard" w:hAnsi="Pretendard" w:eastAsia="Pretendard" w:cs="Pretendard"/>
+            <w:sz w:val="21"/>
+            <w:color w:val="1d4ed8"/>
+            <w:u w:val="single"/>
+          </w:rPr>
+          <w:t xml:space="preserve">issue #4601</w:t>
+        </w:r>
+      </w:hyperlink>
+      <w:r>
+        <w:rPr>
+          <w:rFonts w:ascii="Pretendard" w:hAnsi="Pretendard" w:eastAsia="Pretendard" w:cs="Pretendard"/>
+          <w:b w:val="0"/>
+          <w:i w:val="0"/>
+          <w:color w:val="1F2937"/>
+          <w:sz w:val="21"/>
+        </w:rPr>
+        <w:t xml:space="preserve">, </w:t>
+      </w:r>
+      <w:hyperlink r:id="rId21">
+        <w:r>
+          <w:rPr>
+            <w:rFonts w:ascii="Pretendard" w:hAnsi="Pretendard" w:eastAsia="Pretendard" w:cs="Pretendard"/>
+            <w:sz w:val="21"/>
+            <w:color w:val="1d4ed8"/>
+            <w:u w:val="single"/>
+          </w:rPr>
+          <w:t xml:space="preserve">PR #5795</w:t>
+        </w:r>
+      </w:hyperlink>
     </w:p>
     <w:p>
       <w:pPr>
@@ -1236,8 +1498,40 @@
           <w:color w:val="1F2937"/>
           <w:sz w:val="21"/>
         </w:rPr>
-        <w:t xml:space="preserve"> 활용 타입 안전 어설션 — [issue #5589](https://github.com/kotest/kotest/issues/5589), [PR #5789](https://github.com/kotest/kotest/pull/5789)</w:t>
-      </w:r>
+        <w:t xml:space="preserve"> 활용 타입 안전 어설션 — </w:t>
+      </w:r>
+      <w:hyperlink r:id="rId22">
+        <w:r>
+          <w:rPr>
+            <w:rFonts w:ascii="Pretendard" w:hAnsi="Pretendard" w:eastAsia="Pretendard" w:cs="Pretendard"/>
+            <w:sz w:val="21"/>
+            <w:color w:val="1d4ed8"/>
+            <w:u w:val="single"/>
+          </w:rPr>
+          <w:t xml:space="preserve">issue #5589</w:t>
+        </w:r>
+      </w:hyperlink>
+      <w:r>
+        <w:rPr>
+          <w:rFonts w:ascii="Pretendard" w:hAnsi="Pretendard" w:eastAsia="Pretendard" w:cs="Pretendard"/>
+          <w:b w:val="0"/>
+          <w:i w:val="0"/>
+          <w:color w:val="1F2937"/>
+          <w:sz w:val="21"/>
+        </w:rPr>
+        <w:t xml:space="preserve">, </w:t>
+      </w:r>
+      <w:hyperlink r:id="rId23">
+        <w:r>
+          <w:rPr>
+            <w:rFonts w:ascii="Pretendard" w:hAnsi="Pretendard" w:eastAsia="Pretendard" w:cs="Pretendard"/>
+            <w:sz w:val="21"/>
+            <w:color w:val="1d4ed8"/>
+            <w:u w:val="single"/>
+          </w:rPr>
+          <w:t xml:space="preserve">PR #5789</w:t>
+        </w:r>
+      </w:hyperlink>
     </w:p>
     <w:p>
       <w:pPr>
@@ -1263,14 +1557,57 @@
           <w:color w:val="1F2937"/>
           <w:sz w:val="21"/>
         </w:rPr>
-        <w:t xml:space="preserve"> 어설션 체이닝 — [issue #5755](https://github.com/kotest/kotest/issues/5755), [PR #5756](https://github.com/kotest/kotest/pull/5756)</w:t>
-      </w:r>
+        <w:t xml:space="preserve"> 어설션 체이닝 — </w:t>
+      </w:r>
+      <w:hyperlink r:id="rId24">
+        <w:r>
+          <w:rPr>
+            <w:rFonts w:ascii="Pretendard" w:hAnsi="Pretendard" w:eastAsia="Pretendard" w:cs="Pretendard"/>
+            <w:sz w:val="21"/>
+            <w:color w:val="1d4ed8"/>
+            <w:u w:val="single"/>
+          </w:rPr>
+          <w:t xml:space="preserve">issue #5755</w:t>
+        </w:r>
+      </w:hyperlink>
+      <w:r>
+        <w:rPr>
+          <w:rFonts w:ascii="Pretendard" w:hAnsi="Pretendard" w:eastAsia="Pretendard" w:cs="Pretendard"/>
+          <w:b w:val="0"/>
+          <w:i w:val="0"/>
+          <w:color w:val="1F2937"/>
+          <w:sz w:val="21"/>
+        </w:rPr>
+        <w:t xml:space="preserve">, </w:t>
+      </w:r>
+      <w:hyperlink r:id="rId25">
+        <w:r>
+          <w:rPr>
+            <w:rFonts w:ascii="Pretendard" w:hAnsi="Pretendard" w:eastAsia="Pretendard" w:cs="Pretendard"/>
+            <w:sz w:val="21"/>
+            <w:color w:val="1d4ed8"/>
+            <w:u w:val="single"/>
+          </w:rPr>
+          <w:t xml:space="preserve">PR #5756</w:t>
+        </w:r>
+      </w:hyperlink>
     </w:p>
     <w:p>
       <w:pPr>
         <w:keepNext/>
         <w:spacing w:before="200" w:after="80" w:line="276" w:lineRule="auto"/>
       </w:pPr>
+      <w:hyperlink r:id="rId26">
+        <w:r>
+          <w:rPr>
+            <w:rFonts w:ascii="Pretendard" w:hAnsi="Pretendard" w:eastAsia="Pretendard" w:cs="Pretendard"/>
+            <w:sz w:val="25"/>
+            <w:color w:val="1d4ed8"/>
+            <w:u w:val="single"/>
+          </w:rPr>
+          <w:t xml:space="preserve">Armeria</w:t>
+        </w:r>
+      </w:hyperlink>
       <w:r>
         <w:rPr>
           <w:rFonts w:ascii="Pretendard" w:hAnsi="Pretendard" w:eastAsia="Pretendard" w:cs="Pretendard"/>
@@ -1279,7 +1616,7 @@
           <w:color w:val="0F172A"/>
           <w:sz w:val="25"/>
         </w:rPr>
-        <w:t>[Armeria](https://github.com/line/armeria) — LINE 의 Java 기반 비동기 RPC 프레임워크 (5.1k stars)</w:t>
+        <w:t xml:space="preserve"> — LINE 의 Java 기반 비동기 RPC 프레임워크 (5.1k stars)</w:t>
       </w:r>
     </w:p>
     <w:p>
@@ -1326,14 +1663,57 @@
           <w:color w:val="1F2937"/>
           <w:sz w:val="21"/>
         </w:rPr>
-        <w:t xml:space="preserve"> 2026.04) — [issue #4403](https://github.com/line/armeria/issues/4403), [PR #6683](https://github.com/line/armeria/pull/6683)</w:t>
-      </w:r>
+        <w:t xml:space="preserve"> 2026.04) — </w:t>
+      </w:r>
+      <w:hyperlink r:id="rId27">
+        <w:r>
+          <w:rPr>
+            <w:rFonts w:ascii="Pretendard" w:hAnsi="Pretendard" w:eastAsia="Pretendard" w:cs="Pretendard"/>
+            <w:sz w:val="21"/>
+            <w:color w:val="1d4ed8"/>
+            <w:u w:val="single"/>
+          </w:rPr>
+          <w:t xml:space="preserve">issue #4403</w:t>
+        </w:r>
+      </w:hyperlink>
+      <w:r>
+        <w:rPr>
+          <w:rFonts w:ascii="Pretendard" w:hAnsi="Pretendard" w:eastAsia="Pretendard" w:cs="Pretendard"/>
+          <w:b w:val="0"/>
+          <w:i w:val="0"/>
+          <w:color w:val="1F2937"/>
+          <w:sz w:val="21"/>
+        </w:rPr>
+        <w:t xml:space="preserve">, </w:t>
+      </w:r>
+      <w:hyperlink r:id="rId28">
+        <w:r>
+          <w:rPr>
+            <w:rFonts w:ascii="Pretendard" w:hAnsi="Pretendard" w:eastAsia="Pretendard" w:cs="Pretendard"/>
+            <w:sz w:val="21"/>
+            <w:color w:val="1d4ed8"/>
+            <w:u w:val="single"/>
+          </w:rPr>
+          <w:t xml:space="preserve">PR #6683</w:t>
+        </w:r>
+      </w:hyperlink>
     </w:p>
     <w:p>
       <w:pPr>
         <w:keepNext/>
         <w:spacing w:before="200" w:after="80" w:line="276" w:lineRule="auto"/>
       </w:pPr>
+      <w:hyperlink r:id="rId29">
+        <w:r>
+          <w:rPr>
+            <w:rFonts w:ascii="Pretendard" w:hAnsi="Pretendard" w:eastAsia="Pretendard" w:cs="Pretendard"/>
+            <w:sz w:val="25"/>
+            <w:color w:val="1d4ed8"/>
+            <w:u w:val="single"/>
+          </w:rPr>
+          <w:t xml:space="preserve">Spring Batch</w:t>
+        </w:r>
+      </w:hyperlink>
       <w:r>
         <w:rPr>
           <w:rFonts w:ascii="Pretendard" w:hAnsi="Pretendard" w:eastAsia="Pretendard" w:cs="Pretendard"/>
@@ -1342,7 +1722,7 @@
           <w:color w:val="0F172A"/>
           <w:sz w:val="25"/>
         </w:rPr>
-        <w:t>[Spring Batch](https://github.com/spring-projects/spring-batch) — Spring 의 대량 배치 처리 프레임워크 (2.9k stars)</w:t>
+        <w:t xml:space="preserve"> — Spring 의 대량 배치 처리 프레임워크 (2.9k stars)</w:t>
       </w:r>
     </w:p>
     <w:p>
@@ -1374,7 +1754,28 @@
           <w:color w:val="1F2937"/>
           <w:sz w:val="21"/>
         </w:rPr>
-        <w:t>fault-tolerant step chunk scanning 공식 문서 4년 누락 보완 — [issue #3946](https://github.com/spring-projects/spring-batch/issues/3946) (메인테이너 "documentation issue" 라벨 부여)</w:t>
+        <w:t xml:space="preserve">fault-tolerant step chunk scanning 공식 문서 4년 누락 보완 — </w:t>
+      </w:r>
+      <w:hyperlink r:id="rId30">
+        <w:r>
+          <w:rPr>
+            <w:rFonts w:ascii="Pretendard" w:hAnsi="Pretendard" w:eastAsia="Pretendard" w:cs="Pretendard"/>
+            <w:sz w:val="21"/>
+            <w:color w:val="1d4ed8"/>
+            <w:u w:val="single"/>
+          </w:rPr>
+          <w:t xml:space="preserve">issue #3946</w:t>
+        </w:r>
+      </w:hyperlink>
+      <w:r>
+        <w:rPr>
+          <w:rFonts w:ascii="Pretendard" w:hAnsi="Pretendard" w:eastAsia="Pretendard" w:cs="Pretendard"/>
+          <w:b w:val="0"/>
+          <w:i w:val="0"/>
+          <w:color w:val="1F2937"/>
+          <w:sz w:val="21"/>
+        </w:rPr>
+        <w:t xml:space="preserve"> (메인테이너 "documentation issue" 라벨 부여)</w:t>
       </w:r>
     </w:p>
     <w:p>
@@ -1391,7 +1792,28 @@
           <w:color w:val="1F2937"/>
           <w:sz w:val="21"/>
         </w:rPr>
-        <w:t>conditional flow decider order 버그 — [issue #4478](https://github.com/spring-projects/spring-batch/issues/4478) (메인테이너 "this is a bug" 인정)</w:t>
+        <w:t xml:space="preserve">conditional flow decider order 버그 — </w:t>
+      </w:r>
+      <w:hyperlink r:id="rId31">
+        <w:r>
+          <w:rPr>
+            <w:rFonts w:ascii="Pretendard" w:hAnsi="Pretendard" w:eastAsia="Pretendard" w:cs="Pretendard"/>
+            <w:sz w:val="21"/>
+            <w:color w:val="1d4ed8"/>
+            <w:u w:val="single"/>
+          </w:rPr>
+          <w:t xml:space="preserve">issue #4478</w:t>
+        </w:r>
+      </w:hyperlink>
+      <w:r>
+        <w:rPr>
+          <w:rFonts w:ascii="Pretendard" w:hAnsi="Pretendard" w:eastAsia="Pretendard" w:cs="Pretendard"/>
+          <w:b w:val="0"/>
+          <w:i w:val="0"/>
+          <w:color w:val="1F2937"/>
+          <w:sz w:val="21"/>
+        </w:rPr>
+        <w:t xml:space="preserve"> (메인테이너 "this is a bug" 인정)</w:t>
       </w:r>
     </w:p>
     <w:p>
@@ -1399,6 +1821,17 @@
         <w:keepNext/>
         <w:spacing w:before="200" w:after="80" w:line="276" w:lineRule="auto"/>
       </w:pPr>
+      <w:hyperlink r:id="rId32">
+        <w:r>
+          <w:rPr>
+            <w:rFonts w:ascii="Pretendard" w:hAnsi="Pretendard" w:eastAsia="Pretendard" w:cs="Pretendard"/>
+            <w:sz w:val="25"/>
+            <w:color w:val="1d4ed8"/>
+            <w:u w:val="single"/>
+          </w:rPr>
+          <w:t xml:space="preserve">Spring Cloud Gateway</w:t>
+        </w:r>
+      </w:hyperlink>
       <w:r>
         <w:rPr>
           <w:rFonts w:ascii="Pretendard" w:hAnsi="Pretendard" w:eastAsia="Pretendard" w:cs="Pretendard"/>
@@ -1407,7 +1840,7 @@
           <w:color w:val="0F172A"/>
           <w:sz w:val="25"/>
         </w:rPr>
-        <w:t>[Spring Cloud Gateway](https://github.com/spring-cloud/spring-cloud-gateway) — Spring 의 reactive API gateway</w:t>
+        <w:t xml:space="preserve"> — Spring 의 reactive API gateway</w:t>
       </w:r>
     </w:p>
     <w:p>
@@ -1439,7 +1872,28 @@
           <w:color w:val="1F2937"/>
           <w:sz w:val="21"/>
         </w:rPr>
-        <w:t>Apache HttpClient5 쿠키 매니저 기본 비활성화 — [issue #3311](https://github.com/spring-cloud/spring-cloud-gateway/issues/3311) (메인테이너 코멘트 + 구현 준비)</w:t>
+        <w:t xml:space="preserve">Apache HttpClient5 쿠키 매니저 기본 비활성화 — </w:t>
+      </w:r>
+      <w:hyperlink r:id="rId33">
+        <w:r>
+          <w:rPr>
+            <w:rFonts w:ascii="Pretendard" w:hAnsi="Pretendard" w:eastAsia="Pretendard" w:cs="Pretendard"/>
+            <w:sz w:val="21"/>
+            <w:color w:val="1d4ed8"/>
+            <w:u w:val="single"/>
+          </w:rPr>
+          <w:t xml:space="preserve">issue #3311</w:t>
+        </w:r>
+      </w:hyperlink>
+      <w:r>
+        <w:rPr>
+          <w:rFonts w:ascii="Pretendard" w:hAnsi="Pretendard" w:eastAsia="Pretendard" w:cs="Pretendard"/>
+          <w:b w:val="0"/>
+          <w:i w:val="0"/>
+          <w:color w:val="1F2937"/>
+          <w:sz w:val="21"/>
+        </w:rPr>
+        <w:t xml:space="preserve"> (메인테이너 코멘트 + 구현 준비)</w:t>
       </w:r>
     </w:p>
     <w:p>
@@ -1456,7 +1910,28 @@
           <w:color w:val="1F2937"/>
           <w:sz w:val="21"/>
         </w:rPr>
-        <w:t>API Versioning Predicates 공식 문서 보완 — [issue #4024](https://github.com/spring-cloud/spring-cloud-gateway/issues/4024) (머지 가능성 메인테이너 확인)</w:t>
+        <w:t xml:space="preserve">API Versioning Predicates 공식 문서 보완 — </w:t>
+      </w:r>
+      <w:hyperlink r:id="rId34">
+        <w:r>
+          <w:rPr>
+            <w:rFonts w:ascii="Pretendard" w:hAnsi="Pretendard" w:eastAsia="Pretendard" w:cs="Pretendard"/>
+            <w:sz w:val="21"/>
+            <w:color w:val="1d4ed8"/>
+            <w:u w:val="single"/>
+          </w:rPr>
+          <w:t xml:space="preserve">issue #4024</w:t>
+        </w:r>
+      </w:hyperlink>
+      <w:r>
+        <w:rPr>
+          <w:rFonts w:ascii="Pretendard" w:hAnsi="Pretendard" w:eastAsia="Pretendard" w:cs="Pretendard"/>
+          <w:b w:val="0"/>
+          <w:i w:val="0"/>
+          <w:color w:val="1F2937"/>
+          <w:sz w:val="21"/>
+        </w:rPr>
+        <w:t xml:space="preserve"> (머지 가능성 메인테이너 확인)</w:t>
       </w:r>
     </w:p>
     <w:p>
@@ -1530,10 +2005,10 @@
                     <pic:cNvPicPr/>
                   </pic:nvPicPr>
                   <pic:blipFill>
-                    <a:blip r:embed="rId10">
+                    <a:blip r:embed="rId35">
                       <a:extLst>
                         <a:ext uri="{96DAC541-7B7A-43D3-8B79-37D633B846F1}">
-                          <asvg:svgBlip xmlns:asvg="http://schemas.microsoft.com/office/drawing/2016/SVG/main" r:embed="rId16"/>
+                          <asvg:svgBlip xmlns:asvg="http://schemas.microsoft.com/office/drawing/2016/SVG/main" r:embed="rId44"/>
                         </a:ext>
                       </a:extLst>
                     </a:blip>
@@ -1623,10 +2098,10 @@
                     <pic:cNvPicPr/>
                   </pic:nvPicPr>
                   <pic:blipFill>
-                    <a:blip r:embed="rId11">
+                    <a:blip r:embed="rId36">
                       <a:extLst>
                         <a:ext uri="{96DAC541-7B7A-43D3-8B79-37D633B846F1}">
-                          <asvg:svgBlip xmlns:asvg="http://schemas.microsoft.com/office/drawing/2016/SVG/main" r:embed="rId17"/>
+                          <asvg:svgBlip xmlns:asvg="http://schemas.microsoft.com/office/drawing/2016/SVG/main" r:embed="rId45"/>
                         </a:ext>
                       </a:extLst>
                     </a:blip>
@@ -2548,7 +3023,28 @@
           <w:color w:val="1F2937"/>
           <w:sz w:val="21"/>
         </w:rPr>
-        <w:t xml:space="preserve"> · ShedLock cron · QueryDSL 차집합 (재설계 프로젝트 [commerce-comment-platform-be](https://github.com/PreAgile/commerce-comment-platform-be) 에서 동일 시나리오 재현)</w:t>
+        <w:t xml:space="preserve"> · ShedLock cron · QueryDSL 차집합 (재설계 프로젝트 </w:t>
+      </w:r>
+      <w:hyperlink r:id="rId37">
+        <w:r>
+          <w:rPr>
+            <w:rFonts w:ascii="Pretendard" w:hAnsi="Pretendard" w:eastAsia="Pretendard" w:cs="Pretendard"/>
+            <w:sz w:val="21"/>
+            <w:color w:val="1d4ed8"/>
+            <w:u w:val="single"/>
+          </w:rPr>
+          <w:t xml:space="preserve">commerce-comment-platform-be</w:t>
+        </w:r>
+      </w:hyperlink>
+      <w:r>
+        <w:rPr>
+          <w:rFonts w:ascii="Pretendard" w:hAnsi="Pretendard" w:eastAsia="Pretendard" w:cs="Pretendard"/>
+          <w:b w:val="0"/>
+          <w:i w:val="0"/>
+          <w:color w:val="1F2937"/>
+          <w:sz w:val="21"/>
+        </w:rPr>
+        <w:t xml:space="preserve"> 에서 동일 시나리오 재현)</w:t>
       </w:r>
     </w:p>
     <w:p>
@@ -2588,10 +3084,10 @@
                     <pic:cNvPicPr/>
                   </pic:nvPicPr>
                   <pic:blipFill>
-                    <a:blip r:embed="rId12">
+                    <a:blip r:embed="rId38">
                       <a:extLst>
                         <a:ext uri="{96DAC541-7B7A-43D3-8B79-37D633B846F1}">
-                          <asvg:svgBlip xmlns:asvg="http://schemas.microsoft.com/office/drawing/2016/SVG/main" r:embed="rId18"/>
+                          <asvg:svgBlip xmlns:asvg="http://schemas.microsoft.com/office/drawing/2016/SVG/main" r:embed="rId46"/>
                         </a:ext>
                       </a:extLst>
                     </a:blip>
@@ -3190,7 +3686,28 @@
           <w:color w:val="1F2937"/>
           <w:sz w:val="21"/>
         </w:rPr>
-        <w:t xml:space="preserve"> (CAS) · Spring Batch + ShedLock + QuerydslZeroOffset Reader · Resilience4j Bulkhead.semaphore (계정 단위 동시성) + CircuitBreaker (도미노 차단) · Kafka Outbox / Consumer 멱등 + DLQ (재설계 프로젝트 [commerce-batch-orchestrator](https://github.com/PreAgile/commerce-batch-orchestrator) 에서 RabbitMQ↔Kafka 정량 비교)</w:t>
+        <w:t xml:space="preserve"> (CAS) · Spring Batch + ShedLock + QuerydslZeroOffset Reader · Resilience4j Bulkhead.semaphore (계정 단위 동시성) + CircuitBreaker (도미노 차단) · Kafka Outbox / Consumer 멱등 + DLQ (재설계 프로젝트 </w:t>
+      </w:r>
+      <w:hyperlink r:id="rId39">
+        <w:r>
+          <w:rPr>
+            <w:rFonts w:ascii="Pretendard" w:hAnsi="Pretendard" w:eastAsia="Pretendard" w:cs="Pretendard"/>
+            <w:sz w:val="21"/>
+            <w:color w:val="1d4ed8"/>
+            <w:u w:val="single"/>
+          </w:rPr>
+          <w:t xml:space="preserve">commerce-batch-orchestrator</w:t>
+        </w:r>
+      </w:hyperlink>
+      <w:r>
+        <w:rPr>
+          <w:rFonts w:ascii="Pretendard" w:hAnsi="Pretendard" w:eastAsia="Pretendard" w:cs="Pretendard"/>
+          <w:b w:val="0"/>
+          <w:i w:val="0"/>
+          <w:color w:val="1F2937"/>
+          <w:sz w:val="21"/>
+        </w:rPr>
+        <w:t xml:space="preserve"> 에서 RabbitMQ↔Kafka 정량 비교)</w:t>
       </w:r>
     </w:p>
     <w:p>
@@ -3230,10 +3747,10 @@
                     <pic:cNvPicPr/>
                   </pic:nvPicPr>
                   <pic:blipFill>
-                    <a:blip r:embed="rId13">
+                    <a:blip r:embed="rId40">
                       <a:extLst>
                         <a:ext uri="{96DAC541-7B7A-43D3-8B79-37D633B846F1}">
-                          <asvg:svgBlip xmlns:asvg="http://schemas.microsoft.com/office/drawing/2016/SVG/main" r:embed="rId19"/>
+                          <asvg:svgBlip xmlns:asvg="http://schemas.microsoft.com/office/drawing/2016/SVG/main" r:embed="rId47"/>
                         </a:ext>
                       </a:extLst>
                     </a:blip>
@@ -4180,7 +4697,28 @@
           <w:color w:val="1F2937"/>
           <w:sz w:val="21"/>
         </w:rPr>
-        <w:t xml:space="preserve"> per-key in-process layer · sealed class 로 인증 쿠키 상태 discriminated union · Resilience4j Bulkhead 외부 의존성별 풀 분리 (재설계 프로젝트 [commerce-external-gateway-kt](https://github.com/PreAgile/commerce-external-gateway-kt) 에서 7 가지 행동 계약 spec 으로 명문화)</w:t>
+        <w:t xml:space="preserve"> per-key in-process layer · sealed class 로 인증 쿠키 상태 discriminated union · Resilience4j Bulkhead 외부 의존성별 풀 분리 (재설계 프로젝트 </w:t>
+      </w:r>
+      <w:hyperlink r:id="rId41">
+        <w:r>
+          <w:rPr>
+            <w:rFonts w:ascii="Pretendard" w:hAnsi="Pretendard" w:eastAsia="Pretendard" w:cs="Pretendard"/>
+            <w:sz w:val="21"/>
+            <w:color w:val="1d4ed8"/>
+            <w:u w:val="single"/>
+          </w:rPr>
+          <w:t xml:space="preserve">commerce-external-gateway-kt</w:t>
+        </w:r>
+      </w:hyperlink>
+      <w:r>
+        <w:rPr>
+          <w:rFonts w:ascii="Pretendard" w:hAnsi="Pretendard" w:eastAsia="Pretendard" w:cs="Pretendard"/>
+          <w:b w:val="0"/>
+          <w:i w:val="0"/>
+          <w:color w:val="1F2937"/>
+          <w:sz w:val="21"/>
+        </w:rPr>
+        <w:t xml:space="preserve"> 에서 7 가지 행동 계약 spec 으로 명문화)</w:t>
       </w:r>
     </w:p>
     <w:p>
@@ -4220,10 +4758,10 @@
                     <pic:cNvPicPr/>
                   </pic:nvPicPr>
                   <pic:blipFill>
-                    <a:blip r:embed="rId14">
+                    <a:blip r:embed="rId42">
                       <a:extLst>
                         <a:ext uri="{96DAC541-7B7A-43D3-8B79-37D633B846F1}">
-                          <asvg:svgBlip xmlns:asvg="http://schemas.microsoft.com/office/drawing/2016/SVG/main" r:embed="rId20"/>
+                          <asvg:svgBlip xmlns:asvg="http://schemas.microsoft.com/office/drawing/2016/SVG/main" r:embed="rId48"/>
                         </a:ext>
                       </a:extLst>
                     </a:blip>
@@ -5034,7 +5572,28 @@
           <w:color w:val="1F2937"/>
           <w:sz w:val="21"/>
         </w:rPr>
-        <w:t xml:space="preserve"> 로 env 정책 (재설계 프로젝트 [commerce-external-gateway-kt](https://github.com/PreAgile/commerce-external-gateway-kt))</w:t>
+        <w:t xml:space="preserve"> 로 env 정책 (재설계 프로젝트 </w:t>
+      </w:r>
+      <w:hyperlink r:id="rId41">
+        <w:r>
+          <w:rPr>
+            <w:rFonts w:ascii="Pretendard" w:hAnsi="Pretendard" w:eastAsia="Pretendard" w:cs="Pretendard"/>
+            <w:sz w:val="21"/>
+            <w:color w:val="1d4ed8"/>
+            <w:u w:val="single"/>
+          </w:rPr>
+          <w:t xml:space="preserve">commerce-external-gateway-kt</w:t>
+        </w:r>
+      </w:hyperlink>
+      <w:r>
+        <w:rPr>
+          <w:rFonts w:ascii="Pretendard" w:hAnsi="Pretendard" w:eastAsia="Pretendard" w:cs="Pretendard"/>
+          <w:b w:val="0"/>
+          <w:i w:val="0"/>
+          <w:color w:val="1F2937"/>
+          <w:sz w:val="21"/>
+        </w:rPr>
+        <w:t>)</w:t>
       </w:r>
     </w:p>
     <w:p>
@@ -5074,10 +5633,10 @@
                     <pic:cNvPicPr/>
                   </pic:nvPicPr>
                   <pic:blipFill>
-                    <a:blip r:embed="rId15">
+                    <a:blip r:embed="rId43">
                       <a:extLst>
                         <a:ext uri="{96DAC541-7B7A-43D3-8B79-37D633B846F1}">
-                          <asvg:svgBlip xmlns:asvg="http://schemas.microsoft.com/office/drawing/2016/SVG/main" r:embed="rId21"/>
+                          <asvg:svgBlip xmlns:asvg="http://schemas.microsoft.com/office/drawing/2016/SVG/main" r:embed="rId49"/>
                         </a:ext>
                       </a:extLst>
                     </a:blip>
@@ -5666,7 +6225,28 @@
           <w:color w:val="1F2937"/>
           <w:sz w:val="21"/>
         </w:rPr>
-        <w:t xml:space="preserve"> 복합키 페이지네이션 (재설계 프로젝트 [commerce-comment-platform-be](https://github.com/PreAgile/commerce-comment-platform-be))</w:t>
+        <w:t xml:space="preserve"> 복합키 페이지네이션 (재설계 프로젝트 </w:t>
+      </w:r>
+      <w:hyperlink r:id="rId37">
+        <w:r>
+          <w:rPr>
+            <w:rFonts w:ascii="Pretendard" w:hAnsi="Pretendard" w:eastAsia="Pretendard" w:cs="Pretendard"/>
+            <w:sz w:val="21"/>
+            <w:color w:val="1d4ed8"/>
+            <w:u w:val="single"/>
+          </w:rPr>
+          <w:t xml:space="preserve">commerce-comment-platform-be</w:t>
+        </w:r>
+      </w:hyperlink>
+      <w:r>
+        <w:rPr>
+          <w:rFonts w:ascii="Pretendard" w:hAnsi="Pretendard" w:eastAsia="Pretendard" w:cs="Pretendard"/>
+          <w:b w:val="0"/>
+          <w:i w:val="0"/>
+          <w:color w:val="1F2937"/>
+          <w:sz w:val="21"/>
+        </w:rPr>
+        <w:t>)</w:t>
       </w:r>
     </w:p>
     <w:p>
@@ -6071,6 +6651,17 @@
         <w:keepNext/>
         <w:spacing w:before="200" w:after="80" w:line="276" w:lineRule="auto"/>
       </w:pPr>
+      <w:hyperlink r:id="rId37">
+        <w:r>
+          <w:rPr>
+            <w:rFonts w:ascii="Pretendard" w:hAnsi="Pretendard" w:eastAsia="Pretendard" w:cs="Pretendard"/>
+            <w:sz w:val="25"/>
+            <w:color w:val="1d4ed8"/>
+            <w:u w:val="single"/>
+          </w:rPr>
+          <w:t xml:space="preserve">commerce-comment-platform-be</w:t>
+        </w:r>
+      </w:hyperlink>
       <w:r>
         <w:rPr>
           <w:rFonts w:ascii="Pretendard" w:hAnsi="Pretendard" w:eastAsia="Pretendard" w:cs="Pretendard"/>
@@ -6079,7 +6670,7 @@
           <w:color w:val="0F172A"/>
           <w:sz w:val="25"/>
         </w:rPr>
-        <w:t>[commerce-comment-platform-be](https://github.com/PreAgile/commerce-comment-platform-be) — 결제 도메인 (Java / Spring Boot / JPA)</w:t>
+        <w:t xml:space="preserve"> — 결제 도메인 (Java / Spring Boot / JPA)</w:t>
       </w:r>
     </w:p>
     <w:p>
@@ -6306,6 +6897,17 @@
         <w:keepNext/>
         <w:spacing w:before="200" w:after="80" w:line="276" w:lineRule="auto"/>
       </w:pPr>
+      <w:hyperlink r:id="rId39">
+        <w:r>
+          <w:rPr>
+            <w:rFonts w:ascii="Pretendard" w:hAnsi="Pretendard" w:eastAsia="Pretendard" w:cs="Pretendard"/>
+            <w:sz w:val="25"/>
+            <w:color w:val="1d4ed8"/>
+            <w:u w:val="single"/>
+          </w:rPr>
+          <w:t xml:space="preserve">commerce-batch-orchestrator</w:t>
+        </w:r>
+      </w:hyperlink>
       <w:r>
         <w:rPr>
           <w:rFonts w:ascii="Pretendard" w:hAnsi="Pretendard" w:eastAsia="Pretendard" w:cs="Pretendard"/>
@@ -6314,7 +6916,7 @@
           <w:color w:val="0F172A"/>
           <w:sz w:val="25"/>
         </w:rPr>
-        <w:t>[commerce-batch-orchestrator](https://github.com/PreAgile/commerce-batch-orchestrator) — 배치 / Kafka / Outbox</w:t>
+        <w:t xml:space="preserve"> — 배치 / Kafka / Outbox</w:t>
       </w:r>
     </w:p>
     <w:p>
@@ -6519,6 +7121,17 @@
         <w:keepNext/>
         <w:spacing w:before="200" w:after="80" w:line="276" w:lineRule="auto"/>
       </w:pPr>
+      <w:hyperlink r:id="rId41">
+        <w:r>
+          <w:rPr>
+            <w:rFonts w:ascii="Pretendard" w:hAnsi="Pretendard" w:eastAsia="Pretendard" w:cs="Pretendard"/>
+            <w:sz w:val="25"/>
+            <w:color w:val="1d4ed8"/>
+            <w:u w:val="single"/>
+          </w:rPr>
+          <w:t xml:space="preserve">commerce-external-gateway-kt</w:t>
+        </w:r>
+      </w:hyperlink>
       <w:r>
         <w:rPr>
           <w:rFonts w:ascii="Pretendard" w:hAnsi="Pretendard" w:eastAsia="Pretendard" w:cs="Pretendard"/>
@@ -6527,7 +7140,7 @@
           <w:color w:val="0F172A"/>
           <w:sz w:val="25"/>
         </w:rPr>
-        <w:t>[commerce-external-gateway-kt](https://github.com/PreAgile/commerce-external-gateway-kt) — 외부 게이트웨이 (Kotlin / Coroutines / Resilience4j)</w:t>
+        <w:t xml:space="preserve"> — 외부 게이트웨이 (Kotlin / Coroutines / Resilience4j)</w:t>
       </w:r>
     </w:p>
     <w:p>

</xml_diff>